<commit_message>
Link demo video and update submission evidence
</commit_message>
<xml_diff>
--- a/Heart_Risk_MLOps_Assignment_Report.docx
+++ b/Heart_Risk_MLOps_Assignment_Report.docx
@@ -127,6 +127,23 @@
             <w:u w:val="single"/>
           </w:rPr>
           <w:t>github.com/UjjwalSk/mlops-assignment-1</w:t>
+        </w:r>
+      </w:hyperlink>
+    </w:p>
+    <w:p>
+      <w:pPr>
+        <w:spacing w:before="0" w:after="120"/>
+      </w:pPr>
+      <w:r>
+        <w:t xml:space="preserve">Video demonstration  </w:t>
+      </w:r>
+      <w:hyperlink r:id="rId26">
+        <w:r>
+          <w:rPr>
+            <w:color w:val="087E8B"/>
+            <w:u w:val="single"/>
+          </w:rPr>
+          <w:t>Watch the video on GitHub</w:t>
         </w:r>
       </w:hyperlink>
     </w:p>

</xml_diff>